<commit_message>
websocket chat und protokolle fertiggestellt
</commit_message>
<xml_diff>
--- a/docs/protokolle/FriedlMichaelMeilenstein3.docx
+++ b/docs/protokolle/FriedlMichaelMeilenstein3.docx
@@ -41,7 +41,19 @@
         <w:t>Meilenstein</w:t>
       </w:r>
       <w:r>
-        <w:t>: Meilenstein 2 (Registrierung, Login &amp; Onboarding)</w:t>
+        <w:t xml:space="preserve">: Meilenstein </w:t>
+      </w:r>
+      <w:r>
+        <w:t>3</w:t>
+      </w:r>
+      <w:r>
+        <w:t xml:space="preserve"> (</w:t>
+      </w:r>
+      <w:r>
+        <w:t>Pollen-API, Kalender &amp; Symptom-Tagebuch</w:t>
+      </w:r>
+      <w:r>
+        <w:t>)</w:t>
       </w:r>
     </w:p>
     <w:p>
@@ -63,7 +75,10 @@
         <w:t>:</w:t>
       </w:r>
       <w:r>
-        <w:t xml:space="preserve"> 14.5.2026 – 21.5.2026</w:t>
+        <w:t xml:space="preserve"> </w:t>
+      </w:r>
+      <w:r>
+        <w:t>22.5. – 29.5.2026</w:t>
       </w:r>
     </w:p>
     <w:p>
@@ -96,7 +111,7 @@
         <w:ind w:left="567" w:hanging="567"/>
       </w:pPr>
       <w:r>
-        <w:t>Aufsetzen eines Node.js/Express Servers.</w:t>
+        <w:t>Erweiterung der Datenbank zum Speichern der Symptom-Logs</w:t>
       </w:r>
     </w:p>
     <w:p>
@@ -111,18 +126,7 @@
         <w:ind w:left="567" w:hanging="567"/>
       </w:pPr>
       <w:r>
-        <w:t xml:space="preserve">Einrichtung einer lokalen </w:t>
-      </w:r>
-      <w:proofErr w:type="spellStart"/>
-      <w:r>
-        <w:t>sql</w:t>
-      </w:r>
-      <w:r>
-        <w:t>ite</w:t>
-      </w:r>
-      <w:proofErr w:type="spellEnd"/>
-      <w:r>
-        <w:t>-Datenbank</w:t>
+        <w:t>Implementierung des GET Pollen Endpunkt, um Daten von Open Meteo API abzurufen</w:t>
       </w:r>
     </w:p>
     <w:p>
@@ -137,25 +141,7 @@
         <w:ind w:left="567" w:hanging="567"/>
       </w:pPr>
       <w:r>
-        <w:t xml:space="preserve">Implementierung von DTOs </w:t>
-      </w:r>
-    </w:p>
-    <w:p>
-      <w:pPr>
-        <w:numPr>
-          <w:ilvl w:val="1"/>
-          <w:numId w:val="3"/>
-        </w:numPr>
-        <w:tabs>
-          <w:tab w:val="clear" w:pos="1440"/>
-        </w:tabs>
-        <w:ind w:left="567" w:hanging="567"/>
-      </w:pPr>
-      <w:r>
-        <w:t xml:space="preserve">Entwicklung der </w:t>
-      </w:r>
-      <w:r>
-        <w:t>ersten Endpunkte für Login/Registrierung &amp; Onboarding</w:t>
+        <w:t>Erstellung der Endpunkte zur Verwaltung von Tagebucheinträgen inkl. Dazugehörige Notizen</w:t>
       </w:r>
     </w:p>
     <w:p>
@@ -184,7 +170,31 @@
         <w:ind w:left="567" w:hanging="567"/>
       </w:pPr>
       <w:r>
-        <w:t>Seitenstruktur</w:t>
+        <w:t xml:space="preserve">Dashboard: </w:t>
+      </w:r>
+      <w:r>
+        <w:t>Anbindung an die Browser-Geolocation-API. Anzeige der realen Pollendaten via Ampelsystem. Implementierung eines-Schalters ("Meine Allergien" vs. "Alle Pollen"). Einbau einer Fallback-Logik: Ist GPS deaktiviert, wird standardmäßig</w:t>
+      </w:r>
+      <w:r>
+        <w:t xml:space="preserve"> </w:t>
+      </w:r>
+      <w:r>
+        <w:rPr>
+          <w:iCs/>
+        </w:rPr>
+        <w:t>Pimpfing</w:t>
+      </w:r>
+      <w:r>
+        <w:t xml:space="preserve"> </w:t>
+      </w:r>
+      <w:r>
+        <w:t xml:space="preserve">geladen und der Nutzer </w:t>
+      </w:r>
+      <w:r>
+        <w:t>über einem roten Warn-Banner</w:t>
+      </w:r>
+      <w:r>
+        <w:t xml:space="preserve"> darauf hingewiesen</w:t>
       </w:r>
     </w:p>
     <w:p>
@@ -197,7 +207,7 @@
         <w:ind w:left="567" w:hanging="567"/>
       </w:pPr>
       <w:r>
-        <w:t>Login/Registrierung</w:t>
+        <w:t>Kalender: Implementierung einer 7 Tage Prognose + Suche nach Ort</w:t>
       </w:r>
     </w:p>
     <w:p>
@@ -210,18 +220,7 @@
         <w:ind w:left="567" w:hanging="567"/>
       </w:pPr>
       <w:r>
-        <w:t>Onboarding</w:t>
-      </w:r>
-      <w:r>
-        <w:t xml:space="preserve">: Nach Registrierung erfolgt die Angabe von allergiebetroffenen Pollen (derzeit noch </w:t>
-      </w:r>
-      <w:proofErr w:type="spellStart"/>
-      <w:r>
-        <w:t>hardcodiert</w:t>
-      </w:r>
-      <w:proofErr w:type="spellEnd"/>
-      <w:r>
-        <w:t>, da API-Einbindung noch nicht erfolgt hat).</w:t>
+        <w:t>Tagebuch: Implementierung eines „Tagebuchs“ zum Tracken der Symptome</w:t>
       </w:r>
     </w:p>
     <w:p>
@@ -234,13 +233,9 @@
         <w:ind w:left="567" w:hanging="567"/>
       </w:pPr>
       <w:r>
-        <w:t>Dashboard:</w:t>
-      </w:r>
-      <w:r>
-        <w:t xml:space="preserve"> Welcome-Message und Auflistung der im Onboarding gewählten Pollen</w:t>
+        <w:t>Profil: Neue Seite angelegt, um GPS-Einstellung und ausgewählten Pollen nachträglich zum Onboarding zu ändern</w:t>
       </w:r>
     </w:p>
-    <w:p/>
     <w:p>
       <w:pPr>
         <w:rPr>
@@ -251,177 +246,16 @@
         <w:rPr>
           <w:b/>
         </w:rPr>
-        <w:t>KI-Einsatz</w:t>
-      </w:r>
-      <w:r>
-        <w:rPr>
-          <w:b/>
-        </w:rPr>
-        <w:t>:</w:t>
+        <w:t>Wie liegt man im Zeitplan?</w:t>
       </w:r>
     </w:p>
     <w:p>
       <w:r>
-        <w:t>Gemini: Error-Handling, Styling, Code-</w:t>
-      </w:r>
-      <w:proofErr w:type="spellStart"/>
-      <w:r>
-        <w:t>Refactoring</w:t>
-      </w:r>
-      <w:proofErr w:type="spellEnd"/>
-    </w:p>
-    <w:p>
-      <w:r>
-        <w:t>Design.com: Erstellen des Logos („</w:t>
-      </w:r>
-      <w:r>
-        <w:rPr>
-          <w:i/>
-        </w:rPr>
-        <w:t xml:space="preserve">erstelle mir ein logo für eine </w:t>
-      </w:r>
-      <w:proofErr w:type="spellStart"/>
-      <w:r>
-        <w:rPr>
-          <w:i/>
-        </w:rPr>
-        <w:t>app</w:t>
-      </w:r>
-      <w:proofErr w:type="spellEnd"/>
-      <w:r>
-        <w:rPr>
-          <w:i/>
-        </w:rPr>
-        <w:t xml:space="preserve"> zum überwachen des </w:t>
-      </w:r>
-      <w:proofErr w:type="spellStart"/>
-      <w:r>
-        <w:rPr>
-          <w:i/>
-        </w:rPr>
-        <w:t>pollenflugs</w:t>
-      </w:r>
-      <w:proofErr w:type="spellEnd"/>
-      <w:r>
-        <w:rPr>
-          <w:i/>
-        </w:rPr>
-        <w:t xml:space="preserve"> für </w:t>
-      </w:r>
-      <w:proofErr w:type="spellStart"/>
-      <w:r>
-        <w:rPr>
-          <w:i/>
-        </w:rPr>
-        <w:t>allergiker</w:t>
-      </w:r>
-      <w:proofErr w:type="spellEnd"/>
-      <w:r>
-        <w:rPr>
-          <w:i/>
-        </w:rPr>
-        <w:t xml:space="preserve"> es soll </w:t>
-      </w:r>
-      <w:proofErr w:type="spellStart"/>
-      <w:r>
-        <w:rPr>
-          <w:i/>
-        </w:rPr>
-        <w:t>pollenradar</w:t>
-      </w:r>
-      <w:proofErr w:type="spellEnd"/>
-      <w:r>
-        <w:rPr>
-          <w:i/>
-        </w:rPr>
-        <w:t xml:space="preserve"> </w:t>
-      </w:r>
-      <w:proofErr w:type="spellStart"/>
-      <w:r>
-        <w:rPr>
-          <w:i/>
-        </w:rPr>
-        <w:t>heissen</w:t>
-      </w:r>
-      <w:proofErr w:type="spellEnd"/>
-      <w:r>
-        <w:rPr>
-          <w:i/>
-        </w:rPr>
-        <w:t xml:space="preserve">, und das </w:t>
-      </w:r>
-      <w:proofErr w:type="spellStart"/>
-      <w:r>
-        <w:rPr>
-          <w:i/>
-        </w:rPr>
-        <w:t>logo</w:t>
-      </w:r>
-      <w:proofErr w:type="spellEnd"/>
-      <w:r>
-        <w:rPr>
-          <w:i/>
-        </w:rPr>
-        <w:t xml:space="preserve"> soll eine </w:t>
-      </w:r>
-      <w:proofErr w:type="spellStart"/>
-      <w:r>
-        <w:rPr>
-          <w:i/>
-        </w:rPr>
-        <w:t>mischung</w:t>
-      </w:r>
-      <w:proofErr w:type="spellEnd"/>
-      <w:r>
-        <w:rPr>
-          <w:i/>
-        </w:rPr>
-        <w:t xml:space="preserve"> aus einem u </w:t>
-      </w:r>
-      <w:proofErr w:type="spellStart"/>
-      <w:r>
-        <w:rPr>
-          <w:i/>
-        </w:rPr>
-        <w:t>boot</w:t>
-      </w:r>
-      <w:proofErr w:type="spellEnd"/>
-      <w:r>
-        <w:rPr>
-          <w:i/>
-        </w:rPr>
-        <w:t xml:space="preserve"> </w:t>
-      </w:r>
-      <w:proofErr w:type="spellStart"/>
-      <w:r>
-        <w:rPr>
-          <w:i/>
-        </w:rPr>
-        <w:t>radar</w:t>
-      </w:r>
-      <w:proofErr w:type="spellEnd"/>
-      <w:r>
-        <w:rPr>
-          <w:i/>
-        </w:rPr>
-        <w:t xml:space="preserve"> und einem </w:t>
-      </w:r>
-      <w:proofErr w:type="spellStart"/>
-      <w:r>
-        <w:rPr>
-          <w:i/>
-        </w:rPr>
-        <w:t>pollensymbol</w:t>
-      </w:r>
-      <w:proofErr w:type="spellEnd"/>
-      <w:r>
-        <w:rPr>
-          <w:i/>
-        </w:rPr>
-        <w:t xml:space="preserve"> sein</w:t>
-      </w:r>
-      <w:r>
-        <w:t>“)</w:t>
+        <w:t>On Track:</w:t>
+      </w:r>
+      <w:r>
+        <w:br/>
+        <w:t>Alles geplante wurde umgesetzt und läuft laut passierten Tests sauber</w:t>
       </w:r>
     </w:p>
     <w:p/>
@@ -449,7 +283,7 @@
         <w:ind w:left="567" w:hanging="567"/>
       </w:pPr>
       <w:r>
-        <w:t>Einbindung der externen API für die Pollendaten.</w:t>
+        <w:t>Integration der OpenAI API für die KI-Unterstützung bei Allergieerscheinungen</w:t>
       </w:r>
     </w:p>
     <w:p>
@@ -462,10 +296,7 @@
         <w:ind w:left="567" w:hanging="567"/>
       </w:pPr>
       <w:r>
-        <w:t>Darstellung der Pollendaten im Dashboard und im Kalender</w:t>
-      </w:r>
-      <w:r>
-        <w:t>.</w:t>
+        <w:t>Einbindungen von Statistiken und Vorhersagen im Dashboard</w:t>
       </w:r>
     </w:p>
     <w:p>
@@ -478,7 +309,7 @@
         <w:ind w:left="567" w:hanging="567"/>
       </w:pPr>
       <w:r>
-        <w:t>Implementierung des Pollentagebuchs samt zugehörigen Datenbankeinträgen im Backend.</w:t>
+        <w:t>Erweiterung der Profileinstellungen</w:t>
       </w:r>
     </w:p>
     <w:sectPr>

</xml_diff>